<commit_message>
AC 40: drop Request-Id and UCP-Agent validation from story and handover
Co-Authored-By: Claude Sonnet 5.5 <noreply@anthropic.com>
Claude-Session: https://claude.ai/code/session_01FYgjUeohhjh52GDika8UXZ
</commit_message>
<xml_diff>
--- a/AC-40-test-handover.docx
+++ b/AC-40-test-handover.docx
@@ -190,7 +190,7 @@
         <w:pStyle w:val="Compact"/>
       </w:pPr>
       <w:r>
-        <w:t xml:space="preserve">checks the</w:t>
+        <w:t xml:space="preserve">rewrites</w:t>
       </w:r>
       <w:r>
         <w:t xml:space="preserve"> </w:t>
@@ -199,13 +199,13 @@
         <w:rPr>
           <w:rStyle w:val="VerbatimChar"/>
         </w:rPr>
-        <w:t xml:space="preserve">Request-Id</w:t>
-      </w:r>
-      <w:r>
-        <w:t xml:space="preserve"> </w:t>
-      </w:r>
-      <w:r>
-        <w:t xml:space="preserve">and</w:t>
+        <w:t xml:space="preserve">GET /orders/{id}</w:t>
+      </w:r>
+      <w:r>
+        <w:t xml:space="preserve"> </w:t>
+      </w:r>
+      <w:r>
+        <w:t xml:space="preserve">to the API’s</w:t>
       </w:r>
       <w:r>
         <w:t xml:space="preserve"> </w:t>
@@ -214,13 +214,7 @@
         <w:rPr>
           <w:rStyle w:val="VerbatimChar"/>
         </w:rPr>
-        <w:t xml:space="preserve">UCP-Agent</w:t>
-      </w:r>
-      <w:r>
-        <w:t xml:space="preserve"> </w:t>
-      </w:r>
-      <w:r>
-        <w:t xml:space="preserve">headers</w:t>
+        <w:t xml:space="preserve">GET /order/{orderId}</w:t>
       </w:r>
     </w:p>
     <w:p>
@@ -232,42 +226,6 @@
         <w:pStyle w:val="Compact"/>
       </w:pPr>
       <w:r>
-        <w:t xml:space="preserve">rewrites</w:t>
-      </w:r>
-      <w:r>
-        <w:t xml:space="preserve"> </w:t>
-      </w:r>
-      <w:r>
-        <w:rPr>
-          <w:rStyle w:val="VerbatimChar"/>
-        </w:rPr>
-        <w:t xml:space="preserve">GET /orders/{id}</w:t>
-      </w:r>
-      <w:r>
-        <w:t xml:space="preserve"> </w:t>
-      </w:r>
-      <w:r>
-        <w:t xml:space="preserve">to the API’s</w:t>
-      </w:r>
-      <w:r>
-        <w:t xml:space="preserve"> </w:t>
-      </w:r>
-      <w:r>
-        <w:rPr>
-          <w:rStyle w:val="VerbatimChar"/>
-        </w:rPr>
-        <w:t xml:space="preserve">GET /order/{orderId}</w:t>
-      </w:r>
-    </w:p>
-    <w:p>
-      <w:pPr>
-        <w:numPr>
-          <w:ilvl w:val="0"/>
-          <w:numId w:val="1001"/>
-        </w:numPr>
-        <w:pStyle w:val="Compact"/>
-      </w:pPr>
-      <w:r>
         <w:t xml:space="preserve">sets the</w:t>
       </w:r>
       <w:r>
@@ -344,7 +302,7 @@
         <w:t xml:space="preserve"> </w:t>
       </w:r>
       <w:r>
-        <w:t xml:space="preserve">with a required string order ID. Validate required</w:t>
+        <w:t xml:space="preserve">with a required string order ID. Serve the endpoint over HTTPS with TLS 1.3 or higher. The</w:t>
       </w:r>
       <w:r>
         <w:t xml:space="preserve"> </w:t>
@@ -374,22 +332,7 @@
         <w:t xml:space="preserve"> </w:t>
       </w:r>
       <w:r>
-        <w:t xml:space="preserve">headers; the latter must contain a profile URL ending in</w:t>
-      </w:r>
-      <w:r>
-        <w:t xml:space="preserve"> </w:t>
-      </w:r>
-      <w:r>
-        <w:rPr>
-          <w:rStyle w:val="VerbatimChar"/>
-        </w:rPr>
-        <w:t xml:space="preserve">/.well-known/ucp</w:t>
-      </w:r>
-      <w:r>
-        <w:t xml:space="preserve"> </w:t>
-      </w:r>
-      <w:r>
-        <w:t xml:space="preserve">using RFC 8941 dictionary syntax. Serve the endpoint over HTTPS with TLS 1.3 or higher.</w:t>
+        <w:t xml:space="preserve">headers are not validated by this API or its gateway.</w:t>
       </w:r>
     </w:p>
     <w:p>
@@ -1068,70 +1011,19 @@
               <w:jc w:val="left"/>
             </w:pPr>
             <w:r>
-              <w:t xml:space="preserve">Send the request without</w:t>
-            </w:r>
-            <w:r>
-              <w:t xml:space="preserve"> </w:t>
-            </w:r>
-            <w:r>
-              <w:rPr>
-                <w:rStyle w:val="VerbatimChar"/>
-              </w:rPr>
-              <w:t xml:space="preserve">Request-Id</w:t>
-            </w:r>
-            <w:r>
-              <w:t xml:space="preserve">; separately without</w:t>
-            </w:r>
-            <w:r>
-              <w:t xml:space="preserve"> </w:t>
-            </w:r>
-            <w:r>
-              <w:rPr>
-                <w:rStyle w:val="VerbatimChar"/>
-              </w:rPr>
-              <w:t xml:space="preserve">UCP-Agent</w:t>
-            </w:r>
-            <w:r>
-              <w:t xml:space="preserve">; separately with a</w:t>
-            </w:r>
-            <w:r>
-              <w:t xml:space="preserve"> </w:t>
-            </w:r>
-            <w:r>
-              <w:rPr>
-                <w:rStyle w:val="VerbatimChar"/>
-              </w:rPr>
-              <w:t xml:space="preserve">UCP-Agent</w:t>
-            </w:r>
-            <w:r>
-              <w:t xml:space="preserve"> </w:t>
-            </w:r>
-            <w:r>
-              <w:t xml:space="preserve">that is not</w:t>
-            </w:r>
-            <w:r>
-              <w:t xml:space="preserve"> </w:t>
-            </w:r>
-            <w:r>
-              <w:rPr>
-                <w:rStyle w:val="VerbatimChar"/>
-              </w:rPr>
-              <w:t xml:space="preserve">profile="…/.well-known/ucp"</w:t>
-            </w:r>
-            <w:r>
-              <w:t xml:space="preserve">.</w:t>
-            </w:r>
-          </w:p>
-        </w:tc>
-        <w:tc>
-          <w:tcPr/>
-          <w:p>
-            <w:pPr>
-              <w:pStyle w:val="Compact"/>
-              <w:jc w:val="left"/>
-            </w:pPr>
-            <w:r>
-              <w:t xml:space="preserve">Each is rejected with 400.</w:t>
+              <w:t xml:space="preserve">Connect with TLS 1.2 only, then with TLS 1.3.</w:t>
+            </w:r>
+          </w:p>
+        </w:tc>
+        <w:tc>
+          <w:tcPr/>
+          <w:p>
+            <w:pPr>
+              <w:pStyle w:val="Compact"/>
+              <w:jc w:val="left"/>
+            </w:pPr>
+            <w:r>
+              <w:t xml:space="preserve">TLS 1.2 refused; TLS 1.3 succeeds.</w:t>
             </w:r>
           </w:p>
         </w:tc>
@@ -1181,31 +1073,31 @@
               <w:jc w:val="left"/>
             </w:pPr>
             <w:r>
-              <w:t xml:space="preserve">Connect with TLS 1.2 only, then with TLS 1.3.</w:t>
-            </w:r>
-          </w:p>
-        </w:tc>
-        <w:tc>
-          <w:tcPr/>
-          <w:p>
-            <w:pPr>
-              <w:pStyle w:val="Compact"/>
-              <w:jc w:val="left"/>
-            </w:pPr>
-            <w:r>
-              <w:t xml:space="preserve">TLS 1.2 refused; TLS 1.3 succeeds.</w:t>
-            </w:r>
-          </w:p>
-        </w:tc>
-        <w:tc>
-          <w:tcPr/>
-          <w:p>
-            <w:pPr>
-              <w:pStyle w:val="Compact"/>
-              <w:jc w:val="left"/>
-            </w:pPr>
-            <w:r>
-              <w:t xml:space="preserve">AC 1</w:t>
+              <w:t xml:space="preserve">Send no token; an expired or invalid token; a token for the other brand.</w:t>
+            </w:r>
+          </w:p>
+        </w:tc>
+        <w:tc>
+          <w:tcPr/>
+          <w:p>
+            <w:pPr>
+              <w:pStyle w:val="Compact"/>
+              <w:jc w:val="left"/>
+            </w:pPr>
+            <w:r>
+              <w:t xml:space="preserve">401 each time.</w:t>
+            </w:r>
+          </w:p>
+        </w:tc>
+        <w:tc>
+          <w:tcPr/>
+          <w:p>
+            <w:pPr>
+              <w:pStyle w:val="Compact"/>
+              <w:jc w:val="left"/>
+            </w:pPr>
+            <w:r>
+              <w:t xml:space="preserve">AC 2</w:t>
             </w:r>
           </w:p>
         </w:tc>
@@ -1243,43 +1135,43 @@
               <w:jc w:val="left"/>
             </w:pPr>
             <w:r>
-              <w:t xml:space="preserve">Send no token; an expired or invalid token; a token for the other brand.</w:t>
-            </w:r>
-          </w:p>
-        </w:tc>
-        <w:tc>
-          <w:tcPr/>
-          <w:p>
-            <w:pPr>
-              <w:pStyle w:val="Compact"/>
-              <w:jc w:val="left"/>
-            </w:pPr>
-            <w:r>
-              <w:t xml:space="preserve">401 each time.</w:t>
-            </w:r>
-          </w:p>
-        </w:tc>
-        <w:tc>
-          <w:tcPr/>
-          <w:p>
-            <w:pPr>
-              <w:pStyle w:val="Compact"/>
-              <w:jc w:val="left"/>
-            </w:pPr>
-            <w:r>
-              <w:t xml:space="preserve">AC 2</w:t>
-            </w:r>
-          </w:p>
-        </w:tc>
-        <w:tc>
-          <w:tcPr/>
-          <w:p>
-            <w:pPr>
-              <w:pStyle w:val="Compact"/>
-              <w:jc w:val="left"/>
-            </w:pPr>
-            <w:r>
-              <w:t xml:space="preserve">Gateway</w:t>
+              <w:t xml:space="preserve">Request an existing order and compare the response with the stored snapshot.</w:t>
+            </w:r>
+          </w:p>
+        </w:tc>
+        <w:tc>
+          <w:tcPr/>
+          <w:p>
+            <w:pPr>
+              <w:pStyle w:val="Compact"/>
+              <w:jc w:val="left"/>
+            </w:pPr>
+            <w:r>
+              <w:t xml:space="preserve">Response equals the stored snapshot; no fields added, removed or changed.</w:t>
+            </w:r>
+          </w:p>
+        </w:tc>
+        <w:tc>
+          <w:tcPr/>
+          <w:p>
+            <w:pPr>
+              <w:pStyle w:val="Compact"/>
+              <w:jc w:val="left"/>
+            </w:pPr>
+            <w:r>
+              <w:t xml:space="preserve">AC 3, 4</w:t>
+            </w:r>
+          </w:p>
+        </w:tc>
+        <w:tc>
+          <w:tcPr/>
+          <w:p>
+            <w:pPr>
+              <w:pStyle w:val="Compact"/>
+              <w:jc w:val="left"/>
+            </w:pPr>
+            <w:r>
+              <w:t xml:space="preserve">API</w:t>
             </w:r>
           </w:p>
         </w:tc>
@@ -1294,68 +1186,6 @@
             </w:pPr>
             <w:r>
               <w:t xml:space="preserve">5</w:t>
-            </w:r>
-          </w:p>
-        </w:tc>
-        <w:tc>
-          <w:tcPr/>
-          <w:p>
-            <w:pPr>
-              <w:pStyle w:val="Compact"/>
-              <w:jc w:val="left"/>
-            </w:pPr>
-            <w:r>
-              <w:t xml:space="preserve">Request an existing order and compare the response with the stored snapshot.</w:t>
-            </w:r>
-          </w:p>
-        </w:tc>
-        <w:tc>
-          <w:tcPr/>
-          <w:p>
-            <w:pPr>
-              <w:pStyle w:val="Compact"/>
-              <w:jc w:val="left"/>
-            </w:pPr>
-            <w:r>
-              <w:t xml:space="preserve">Response equals the stored snapshot; no fields added, removed or changed.</w:t>
-            </w:r>
-          </w:p>
-        </w:tc>
-        <w:tc>
-          <w:tcPr/>
-          <w:p>
-            <w:pPr>
-              <w:pStyle w:val="Compact"/>
-              <w:jc w:val="left"/>
-            </w:pPr>
-            <w:r>
-              <w:t xml:space="preserve">AC 3, 4</w:t>
-            </w:r>
-          </w:p>
-        </w:tc>
-        <w:tc>
-          <w:tcPr/>
-          <w:p>
-            <w:pPr>
-              <w:pStyle w:val="Compact"/>
-              <w:jc w:val="left"/>
-            </w:pPr>
-            <w:r>
-              <w:t xml:space="preserve">API</w:t>
-            </w:r>
-          </w:p>
-        </w:tc>
-      </w:tr>
-      <w:tr>
-        <w:tc>
-          <w:tcPr/>
-          <w:p>
-            <w:pPr>
-              <w:pStyle w:val="Compact"/>
-              <w:jc w:val="left"/>
-            </w:pPr>
-            <w:r>
-              <w:t xml:space="preserve">6</w:t>
             </w:r>
           </w:p>
         </w:tc>
@@ -1465,7 +1295,7 @@
               <w:jc w:val="left"/>
             </w:pPr>
             <w:r>
-              <w:t xml:space="preserve">7</w:t>
+              <w:t xml:space="preserve">6</w:t>
             </w:r>
           </w:p>
         </w:tc>
@@ -1551,7 +1381,7 @@
               <w:jc w:val="left"/>
             </w:pPr>
             <w:r>
-              <w:t xml:space="preserve">8</w:t>
+              <w:t xml:space="preserve">7</w:t>
             </w:r>
           </w:p>
         </w:tc>
@@ -1646,7 +1476,7 @@
               <w:jc w:val="left"/>
             </w:pPr>
             <w:r>
-              <w:t xml:space="preserve">9</w:t>
+              <w:t xml:space="preserve">8</w:t>
             </w:r>
           </w:p>
         </w:tc>
@@ -1708,7 +1538,7 @@
               <w:jc w:val="left"/>
             </w:pPr>
             <w:r>
-              <w:t xml:space="preserve">10</w:t>
+              <w:t xml:space="preserve">9</w:t>
             </w:r>
           </w:p>
         </w:tc>
@@ -1785,7 +1615,7 @@
               <w:jc w:val="left"/>
             </w:pPr>
             <w:r>
-              <w:t xml:space="preserve">11</w:t>
+              <w:t xml:space="preserve">10</w:t>
             </w:r>
           </w:p>
         </w:tc>
@@ -1847,7 +1677,7 @@
               <w:jc w:val="left"/>
             </w:pPr>
             <w:r>
-              <w:t xml:space="preserve">12</w:t>
+              <w:t xml:space="preserve">11</w:t>
             </w:r>
           </w:p>
         </w:tc>
@@ -1921,7 +1751,7 @@
               <w:jc w:val="left"/>
             </w:pPr>
             <w:r>
-              <w:t xml:space="preserve">13</w:t>
+              <w:t xml:space="preserve">12</w:t>
             </w:r>
           </w:p>
         </w:tc>
@@ -2928,7 +2758,114 @@
       </w:r>
     </w:p>
     <w:bookmarkEnd w:id="24"/>
-    <w:bookmarkStart w:id="25" w:name="notes-for-testers"/>
+    <w:bookmarkStart w:id="25" w:name="example-request"/>
+    <w:p>
+      <w:pPr>
+        <w:pStyle w:val="Heading2"/>
+      </w:pPr>
+      <w:r>
+        <w:t xml:space="preserve">Example request</w:t>
+      </w:r>
+    </w:p>
+    <w:p>
+      <w:pPr>
+        <w:pStyle w:val="FirstParagraph"/>
+      </w:pPr>
+      <w:r>
+        <w:t xml:space="preserve">Only the</w:t>
+      </w:r>
+      <w:r>
+        <w:t xml:space="preserve"> </w:t>
+      </w:r>
+      <w:r>
+        <w:rPr>
+          <w:rStyle w:val="VerbatimChar"/>
+        </w:rPr>
+        <w:t xml:space="preserve">Authorization</w:t>
+      </w:r>
+      <w:r>
+        <w:t xml:space="preserve"> </w:t>
+      </w:r>
+      <w:r>
+        <w:t xml:space="preserve">header is needed; the gateway adds the brand.</w:t>
+      </w:r>
+    </w:p>
+    <w:p>
+      <w:pPr>
+        <w:pStyle w:val="SourceCode"/>
+      </w:pPr>
+      <w:r>
+        <w:rPr>
+          <w:rStyle w:val="ExtensionTok"/>
+        </w:rPr>
+        <w:t xml:space="preserve">curl</w:t>
+      </w:r>
+      <w:r>
+        <w:rPr>
+          <w:rStyle w:val="NormalTok"/>
+        </w:rPr>
+        <w:t xml:space="preserve"> </w:t>
+      </w:r>
+      <w:r>
+        <w:rPr>
+          <w:rStyle w:val="AttributeTok"/>
+        </w:rPr>
+        <w:t xml:space="preserve">--location</w:t>
+      </w:r>
+      <w:r>
+        <w:rPr>
+          <w:rStyle w:val="NormalTok"/>
+        </w:rPr>
+        <w:t xml:space="preserve"> </w:t>
+      </w:r>
+      <w:r>
+        <w:rPr>
+          <w:rStyle w:val="StringTok"/>
+        </w:rPr>
+        <w:t xml:space="preserve">'https://qagw01a.apis.newellbrands.com/yankeecandle/orders/&lt;order-id&gt;'</w:t>
+      </w:r>
+      <w:r>
+        <w:rPr>
+          <w:rStyle w:val="NormalTok"/>
+        </w:rPr>
+        <w:t xml:space="preserve"> </w:t>
+      </w:r>
+      <w:r>
+        <w:rPr>
+          <w:rStyle w:val="DataTypeTok"/>
+        </w:rPr>
+        <w:t xml:space="preserve">\</w:t>
+      </w:r>
+      <w:r>
+        <w:br/>
+      </w:r>
+      <w:r>
+        <w:rPr>
+          <w:rStyle w:val="NormalTok"/>
+        </w:rPr>
+        <w:t xml:space="preserve">  </w:t>
+      </w:r>
+      <w:r>
+        <w:rPr>
+          <w:rStyle w:val="AttributeTok"/>
+        </w:rPr>
+        <w:t xml:space="preserve">--header</w:t>
+      </w:r>
+      <w:r>
+        <w:rPr>
+          <w:rStyle w:val="NormalTok"/>
+        </w:rPr>
+        <w:t xml:space="preserve"> </w:t>
+      </w:r>
+      <w:r>
+        <w:rPr>
+          <w:rStyle w:val="StringTok"/>
+        </w:rPr>
+        <w:t xml:space="preserve">'Authorization: Bearer &lt;token&gt;'</w:t>
+      </w:r>
+    </w:p>
+    <w:bookmarkEnd w:id="25"/>
+    <w:bookmarkStart w:id="26" w:name="notes-for-testers"/>
     <w:p>
       <w:pPr>
         <w:pStyle w:val="Heading2"/>
@@ -2943,25 +2880,33 @@
           <w:ilvl w:val="0"/>
           <w:numId w:val="1003"/>
         </w:numPr>
-        <w:pStyle w:val="Compact"/>
-      </w:pPr>
-      <w:r>
-        <w:t xml:space="preserve">An order has no stored snapshot until its Order Created event has been processed, so a very new order returns</w:t>
-      </w:r>
-      <w:r>
-        <w:t xml:space="preserve"> </w:t>
-      </w:r>
+      </w:pPr>
       <w:r>
         <w:rPr>
           <w:rStyle w:val="VerbatimChar"/>
         </w:rPr>
-        <w:t xml:space="preserve">not_found</w:t>
-      </w:r>
-      <w:r>
-        <w:t xml:space="preserve"> </w:t>
-      </w:r>
-      <w:r>
-        <w:t xml:space="preserve">for a short time.</w:t>
+        <w:t xml:space="preserve">Request-Id</w:t>
+      </w:r>
+      <w:r>
+        <w:t xml:space="preserve"> </w:t>
+      </w:r>
+      <w:r>
+        <w:t xml:space="preserve">and</w:t>
+      </w:r>
+      <w:r>
+        <w:t xml:space="preserve"> </w:t>
+      </w:r>
+      <w:r>
+        <w:rPr>
+          <w:rStyle w:val="VerbatimChar"/>
+        </w:rPr>
+        <w:t xml:space="preserve">UCP-Agent</w:t>
+      </w:r>
+      <w:r>
+        <w:t xml:space="preserve"> </w:t>
+      </w:r>
+      <w:r>
+        <w:t xml:space="preserve">are not validated, so requests without them are accepted.</w:t>
       </w:r>
     </w:p>
     <w:p>
@@ -2970,10 +2915,24 @@
           <w:ilvl w:val="0"/>
           <w:numId w:val="1003"/>
         </w:numPr>
-        <w:pStyle w:val="Compact"/>
-      </w:pPr>
-      <w:r>
-        <w:t xml:space="preserve">The content of a found order (line items, fulfillment events, adjustments) comes from the order-lifecycle stories (AC-23, AC-24, AC-25, AC-35, AC-38). Scenario 5 checks that this API returns the stored snapshot unchanged, not that the snapshot is complete.</w:t>
+      </w:pPr>
+      <w:r>
+        <w:t xml:space="preserve">An order has no stored snapshot until its Order Created event has been processed, so a very new order returns</w:t>
+      </w:r>
+      <w:r>
+        <w:t xml:space="preserve"> </w:t>
+      </w:r>
+      <w:r>
+        <w:rPr>
+          <w:rStyle w:val="VerbatimChar"/>
+        </w:rPr>
+        <w:t xml:space="preserve">not_found</w:t>
+      </w:r>
+      <w:r>
+        <w:t xml:space="preserve"> </w:t>
+      </w:r>
+      <w:r>
+        <w:t xml:space="preserve">for a short time.</w:t>
       </w:r>
     </w:p>
     <w:p>
@@ -2982,10 +2941,9 @@
           <w:ilvl w:val="0"/>
           <w:numId w:val="1003"/>
         </w:numPr>
-        <w:pStyle w:val="Compact"/>
-      </w:pPr>
-      <w:r>
-        <w:t xml:space="preserve">Stale-snapshot behaviour, such as a late Shipped event arriving after Delivered, is tested in the order-lifecycle stories.</w:t>
+      </w:pPr>
+      <w:r>
+        <w:t xml:space="preserve">The content of a found order (line items, fulfillment events, adjustments) comes from the order-lifecycle stories (AC-23, AC-24, AC-25, AC-35, AC-38). Scenario 5 checks that this API returns the stored snapshot unchanged, not that the snapshot is complete.</w:t>
       </w:r>
     </w:p>
     <w:p>
@@ -2994,13 +2952,23 @@
           <w:ilvl w:val="0"/>
           <w:numId w:val="1003"/>
         </w:numPr>
-        <w:pStyle w:val="Compact"/>
+      </w:pPr>
+      <w:r>
+        <w:t xml:space="preserve">Stale-snapshot behaviour, such as a late Shipped event arriving after Delivered, is tested in the order-lifecycle stories.</w:t>
+      </w:r>
+    </w:p>
+    <w:p>
+      <w:pPr>
+        <w:numPr>
+          <w:ilvl w:val="0"/>
+          <w:numId w:val="1003"/>
+        </w:numPr>
       </w:pPr>
       <w:r>
         <w:t xml:space="preserve">A missing or malformed order id or brand returns 400 from the API itself.</w:t>
       </w:r>
     </w:p>
-    <w:bookmarkEnd w:id="25"/>
+    <w:bookmarkEnd w:id="26"/>
     <w:sectPr/>
   </w:body>
 </w:document>

</xml_diff>